<commit_message>
docs: priorización de Casos de Uso
</commit_message>
<xml_diff>
--- a/Etapa Construcción - Iteración 1/Arquitectura del Sistema - Kairos - NexTech.docx
+++ b/Etapa Construcción - Iteración 1/Arquitectura del Sistema - Kairos - NexTech.docx
@@ -828,12 +828,12 @@
             <wp:extent cx="1200150" cy="1200150"/>
             <wp:effectExtent b="0" l="0" r="0" t="0"/>
             <wp:wrapSquare wrapText="bothSides" distB="0" distT="0" distL="114300" distR="114300"/>
-            <wp:docPr descr="psi-negro.png" id="18" name="image2.png"/>
+            <wp:docPr descr="psi-negro.png" id="18" name="image1.png"/>
             <a:graphic>
               <a:graphicData uri="http://schemas.openxmlformats.org/drawingml/2006/picture">
                 <pic:pic>
                   <pic:nvPicPr>
-                    <pic:cNvPr descr="psi-negro.png" id="0" name="image2.png"/>
+                    <pic:cNvPr descr="psi-negro.png" id="0" name="image1.png"/>
                     <pic:cNvPicPr preferRelativeResize="0"/>
                   </pic:nvPicPr>
                   <pic:blipFill>
@@ -883,12 +883,12 @@
             <wp:extent cx="1304925" cy="2019300"/>
             <wp:effectExtent b="0" l="0" r="0" t="0"/>
             <wp:wrapSquare wrapText="bothSides" distB="0" distT="0" distL="114300" distR="114300"/>
-            <wp:docPr descr="UNPA.JPG" id="13" name="image4.jpg"/>
+            <wp:docPr descr="UNPA.JPG" id="13" name="image2.jpg"/>
             <a:graphic>
               <a:graphicData uri="http://schemas.openxmlformats.org/drawingml/2006/picture">
                 <pic:pic>
                   <pic:nvPicPr>
-                    <pic:cNvPr descr="UNPA.JPG" id="0" name="image4.jpg"/>
+                    <pic:cNvPr descr="UNPA.JPG" id="0" name="image2.jpg"/>
                     <pic:cNvPicPr preferRelativeResize="0"/>
                   </pic:nvPicPr>
                   <pic:blipFill>
@@ -1204,12 +1204,12 @@
             <wp:extent cx="1200150" cy="1200150"/>
             <wp:effectExtent b="0" l="0" r="0" t="0"/>
             <wp:wrapSquare wrapText="bothSides" distB="0" distT="0" distL="114300" distR="114300"/>
-            <wp:docPr descr="psi-negro.png" id="12" name="image2.png"/>
+            <wp:docPr descr="psi-negro.png" id="12" name="image1.png"/>
             <a:graphic>
               <a:graphicData uri="http://schemas.openxmlformats.org/drawingml/2006/picture">
                 <pic:pic>
                   <pic:nvPicPr>
-                    <pic:cNvPr descr="psi-negro.png" id="0" name="image2.png"/>
+                    <pic:cNvPr descr="psi-negro.png" id="0" name="image1.png"/>
                     <pic:cNvPicPr preferRelativeResize="0"/>
                   </pic:nvPicPr>
                   <pic:blipFill>
@@ -1307,7 +1307,7 @@
     </w:p>
     <w:sdt>
       <w:sdtPr>
-        <w:id w:val="769351926"/>
+        <w:id w:val="-1959023798"/>
         <w:docPartObj>
           <w:docPartGallery w:val="Table of Contents"/>
           <w:docPartUnique w:val="1"/>
@@ -7847,12 +7847,12 @@
           <wp:extent cx="669290" cy="669290"/>
           <wp:effectExtent b="0" l="0" r="0" t="0"/>
           <wp:wrapSquare wrapText="bothSides" distB="0" distT="0" distL="114300" distR="114300"/>
-          <wp:docPr descr="psi-negro.png" id="14" name="image3.png"/>
+          <wp:docPr descr="psi-negro.png" id="14" name="image4.png"/>
           <a:graphic>
             <a:graphicData uri="http://schemas.openxmlformats.org/drawingml/2006/picture">
               <pic:pic>
                 <pic:nvPicPr>
-                  <pic:cNvPr descr="psi-negro.png" id="0" name="image3.png"/>
+                  <pic:cNvPr descr="psi-negro.png" id="0" name="image4.png"/>
                   <pic:cNvPicPr preferRelativeResize="0"/>
                 </pic:nvPicPr>
                 <pic:blipFill>
@@ -7892,12 +7892,12 @@
           <wp:extent cx="425450" cy="666750"/>
           <wp:effectExtent b="0" l="0" r="0" t="0"/>
           <wp:wrapSquare wrapText="bothSides" distB="0" distT="0" distL="114300" distR="114300"/>
-          <wp:docPr descr="UNPA.JPG" id="16" name="image1.jpg"/>
+          <wp:docPr descr="UNPA.JPG" id="16" name="image3.jpg"/>
           <a:graphic>
             <a:graphicData uri="http://schemas.openxmlformats.org/drawingml/2006/picture">
               <pic:pic>
                 <pic:nvPicPr>
-                  <pic:cNvPr descr="UNPA.JPG" id="0" name="image1.jpg"/>
+                  <pic:cNvPr descr="UNPA.JPG" id="0" name="image3.jpg"/>
                   <pic:cNvPicPr preferRelativeResize="0"/>
                 </pic:nvPicPr>
                 <pic:blipFill>

</xml_diff>

<commit_message>
docs: agregado base de datos Kairos, inicio especificación CU09 y CU20
</commit_message>
<xml_diff>
--- a/Etapa Construcción - Iteración 1/Arquitectura del Sistema - Kairos - NexTech.docx
+++ b/Etapa Construcción - Iteración 1/Arquitectura del Sistema - Kairos - NexTech.docx
@@ -883,12 +883,12 @@
             <wp:extent cx="1304925" cy="2019300"/>
             <wp:effectExtent b="0" l="0" r="0" t="0"/>
             <wp:wrapSquare wrapText="bothSides" distB="0" distT="0" distL="114300" distR="114300"/>
-            <wp:docPr descr="UNPA.JPG" id="13" name="image2.jpg"/>
+            <wp:docPr descr="UNPA.JPG" id="13" name="image4.jpg"/>
             <a:graphic>
               <a:graphicData uri="http://schemas.openxmlformats.org/drawingml/2006/picture">
                 <pic:pic>
                   <pic:nvPicPr>
-                    <pic:cNvPr descr="UNPA.JPG" id="0" name="image2.jpg"/>
+                    <pic:cNvPr descr="UNPA.JPG" id="0" name="image4.jpg"/>
                     <pic:cNvPicPr preferRelativeResize="0"/>
                   </pic:nvPicPr>
                   <pic:blipFill>
@@ -1307,7 +1307,7 @@
     </w:p>
     <w:sdt>
       <w:sdtPr>
-        <w:id w:val="-1959023798"/>
+        <w:id w:val="271094663"/>
         <w:docPartObj>
           <w:docPartGallery w:val="Table of Contents"/>
           <w:docPartUnique w:val="1"/>
@@ -7847,12 +7847,12 @@
           <wp:extent cx="669290" cy="669290"/>
           <wp:effectExtent b="0" l="0" r="0" t="0"/>
           <wp:wrapSquare wrapText="bothSides" distB="0" distT="0" distL="114300" distR="114300"/>
-          <wp:docPr descr="psi-negro.png" id="14" name="image4.png"/>
+          <wp:docPr descr="psi-negro.png" id="14" name="image3.png"/>
           <a:graphic>
             <a:graphicData uri="http://schemas.openxmlformats.org/drawingml/2006/picture">
               <pic:pic>
                 <pic:nvPicPr>
-                  <pic:cNvPr descr="psi-negro.png" id="0" name="image4.png"/>
+                  <pic:cNvPr descr="psi-negro.png" id="0" name="image3.png"/>
                   <pic:cNvPicPr preferRelativeResize="0"/>
                 </pic:nvPicPr>
                 <pic:blipFill>
@@ -7892,12 +7892,12 @@
           <wp:extent cx="425450" cy="666750"/>
           <wp:effectExtent b="0" l="0" r="0" t="0"/>
           <wp:wrapSquare wrapText="bothSides" distB="0" distT="0" distL="114300" distR="114300"/>
-          <wp:docPr descr="UNPA.JPG" id="16" name="image3.jpg"/>
+          <wp:docPr descr="UNPA.JPG" id="16" name="image2.jpg"/>
           <a:graphic>
             <a:graphicData uri="http://schemas.openxmlformats.org/drawingml/2006/picture">
               <pic:pic>
                 <pic:nvPicPr>
-                  <pic:cNvPr descr="UNPA.JPG" id="0" name="image3.jpg"/>
+                  <pic:cNvPr descr="UNPA.JPG" id="0" name="image2.jpg"/>
                   <pic:cNvPicPr preferRelativeResize="0"/>
                 </pic:nvPicPr>
                 <pic:blipFill>

</xml_diff>

<commit_message>
docs(construcción/especificaciones): CU09 y CU20 terminados, CU12 avanzado
</commit_message>
<xml_diff>
--- a/Etapa Construcción - Iteración 1/Arquitectura del Sistema - Kairos - NexTech.docx
+++ b/Etapa Construcción - Iteración 1/Arquitectura del Sistema - Kairos - NexTech.docx
@@ -828,12 +828,12 @@
             <wp:extent cx="1200150" cy="1200150"/>
             <wp:effectExtent b="0" l="0" r="0" t="0"/>
             <wp:wrapSquare wrapText="bothSides" distB="0" distT="0" distL="114300" distR="114300"/>
-            <wp:docPr descr="psi-negro.png" id="18" name="image1.png"/>
+            <wp:docPr descr="psi-negro.png" id="18" name="image4.png"/>
             <a:graphic>
               <a:graphicData uri="http://schemas.openxmlformats.org/drawingml/2006/picture">
                 <pic:pic>
                   <pic:nvPicPr>
-                    <pic:cNvPr descr="psi-negro.png" id="0" name="image1.png"/>
+                    <pic:cNvPr descr="psi-negro.png" id="0" name="image4.png"/>
                     <pic:cNvPicPr preferRelativeResize="0"/>
                   </pic:nvPicPr>
                   <pic:blipFill>
@@ -883,12 +883,12 @@
             <wp:extent cx="1304925" cy="2019300"/>
             <wp:effectExtent b="0" l="0" r="0" t="0"/>
             <wp:wrapSquare wrapText="bothSides" distB="0" distT="0" distL="114300" distR="114300"/>
-            <wp:docPr descr="UNPA.JPG" id="13" name="image4.jpg"/>
+            <wp:docPr descr="UNPA.JPG" id="13" name="image3.jpg"/>
             <a:graphic>
               <a:graphicData uri="http://schemas.openxmlformats.org/drawingml/2006/picture">
                 <pic:pic>
                   <pic:nvPicPr>
-                    <pic:cNvPr descr="UNPA.JPG" id="0" name="image4.jpg"/>
+                    <pic:cNvPr descr="UNPA.JPG" id="0" name="image3.jpg"/>
                     <pic:cNvPicPr preferRelativeResize="0"/>
                   </pic:nvPicPr>
                   <pic:blipFill>
@@ -1204,12 +1204,12 @@
             <wp:extent cx="1200150" cy="1200150"/>
             <wp:effectExtent b="0" l="0" r="0" t="0"/>
             <wp:wrapSquare wrapText="bothSides" distB="0" distT="0" distL="114300" distR="114300"/>
-            <wp:docPr descr="psi-negro.png" id="12" name="image1.png"/>
+            <wp:docPr descr="psi-negro.png" id="12" name="image4.png"/>
             <a:graphic>
               <a:graphicData uri="http://schemas.openxmlformats.org/drawingml/2006/picture">
                 <pic:pic>
                   <pic:nvPicPr>
-                    <pic:cNvPr descr="psi-negro.png" id="0" name="image1.png"/>
+                    <pic:cNvPr descr="psi-negro.png" id="0" name="image4.png"/>
                     <pic:cNvPicPr preferRelativeResize="0"/>
                   </pic:nvPicPr>
                   <pic:blipFill>
@@ -1307,7 +1307,7 @@
     </w:p>
     <w:sdt>
       <w:sdtPr>
-        <w:id w:val="271094663"/>
+        <w:id w:val="-1503217773"/>
         <w:docPartObj>
           <w:docPartGallery w:val="Table of Contents"/>
           <w:docPartUnique w:val="1"/>
@@ -7847,12 +7847,12 @@
           <wp:extent cx="669290" cy="669290"/>
           <wp:effectExtent b="0" l="0" r="0" t="0"/>
           <wp:wrapSquare wrapText="bothSides" distB="0" distT="0" distL="114300" distR="114300"/>
-          <wp:docPr descr="psi-negro.png" id="14" name="image3.png"/>
+          <wp:docPr descr="psi-negro.png" id="14" name="image2.png"/>
           <a:graphic>
             <a:graphicData uri="http://schemas.openxmlformats.org/drawingml/2006/picture">
               <pic:pic>
                 <pic:nvPicPr>
-                  <pic:cNvPr descr="psi-negro.png" id="0" name="image3.png"/>
+                  <pic:cNvPr descr="psi-negro.png" id="0" name="image2.png"/>
                   <pic:cNvPicPr preferRelativeResize="0"/>
                 </pic:nvPicPr>
                 <pic:blipFill>
@@ -7892,12 +7892,12 @@
           <wp:extent cx="425450" cy="666750"/>
           <wp:effectExtent b="0" l="0" r="0" t="0"/>
           <wp:wrapSquare wrapText="bothSides" distB="0" distT="0" distL="114300" distR="114300"/>
-          <wp:docPr descr="UNPA.JPG" id="16" name="image2.jpg"/>
+          <wp:docPr descr="UNPA.JPG" id="16" name="image1.jpg"/>
           <a:graphic>
             <a:graphicData uri="http://schemas.openxmlformats.org/drawingml/2006/picture">
               <pic:pic>
                 <pic:nvPicPr>
-                  <pic:cNvPr descr="UNPA.JPG" id="0" name="image2.jpg"/>
+                  <pic:cNvPr descr="UNPA.JPG" id="0" name="image1.jpg"/>
                   <pic:cNvPicPr preferRelativeResize="0"/>
                 </pic:nvPicPr>
                 <pic:blipFill>

</xml_diff>

<commit_message>
(docs) nuevo código de estimacion
</commit_message>
<xml_diff>
--- a/Etapa Construcción - Iteración 1/Arquitectura del Sistema - Kairos - NexTech.docx
+++ b/Etapa Construcción - Iteración 1/Arquitectura del Sistema - Kairos - NexTech.docx
@@ -196,12 +196,12 @@
                 <wp:extent cx="7940040" cy="810895"/>
                 <wp:effectExtent b="0" l="0" r="0" t="0"/>
                 <wp:wrapNone/>
-                <wp:docPr id="2" name="image8.png"/>
+                <wp:docPr id="2" name="image9.png"/>
                 <a:graphic>
                   <a:graphicData uri="http://schemas.openxmlformats.org/drawingml/2006/picture">
                     <pic:pic>
                       <pic:nvPicPr>
-                        <pic:cNvPr id="0" name="image8.png"/>
+                        <pic:cNvPr id="0" name="image9.png"/>
                         <pic:cNvPicPr preferRelativeResize="0"/>
                       </pic:nvPicPr>
                       <pic:blipFill>
@@ -316,12 +316,12 @@
                 <wp:extent cx="103505" cy="11228070"/>
                 <wp:effectExtent b="0" l="0" r="0" t="0"/>
                 <wp:wrapNone/>
-                <wp:docPr id="11" name="image17.png"/>
+                <wp:docPr id="11" name="image18.png"/>
                 <a:graphic>
                   <a:graphicData uri="http://schemas.openxmlformats.org/drawingml/2006/picture">
                     <pic:pic>
                       <pic:nvPicPr>
-                        <pic:cNvPr id="0" name="image17.png"/>
+                        <pic:cNvPr id="0" name="image18.png"/>
                         <pic:cNvPicPr preferRelativeResize="0"/>
                       </pic:nvPicPr>
                       <pic:blipFill>
@@ -436,12 +436,12 @@
                 <wp:extent cx="103505" cy="11228070"/>
                 <wp:effectExtent b="0" l="0" r="0" t="0"/>
                 <wp:wrapNone/>
-                <wp:docPr id="6" name="image12.png"/>
+                <wp:docPr id="6" name="image13.png"/>
                 <a:graphic>
                   <a:graphicData uri="http://schemas.openxmlformats.org/drawingml/2006/picture">
                     <pic:pic>
                       <pic:nvPicPr>
-                        <pic:cNvPr id="0" name="image12.png"/>
+                        <pic:cNvPr id="0" name="image13.png"/>
                         <pic:cNvPicPr preferRelativeResize="0"/>
                       </pic:nvPicPr>
                       <pic:blipFill>
@@ -556,12 +556,12 @@
                 <wp:extent cx="7940040" cy="810895"/>
                 <wp:effectExtent b="0" l="0" r="0" t="0"/>
                 <wp:wrapNone/>
-                <wp:docPr id="9" name="image15.png"/>
+                <wp:docPr id="9" name="image16.png"/>
                 <a:graphic>
                   <a:graphicData uri="http://schemas.openxmlformats.org/drawingml/2006/picture">
                     <pic:pic>
                       <pic:nvPicPr>
-                        <pic:cNvPr id="0" name="image15.png"/>
+                        <pic:cNvPr id="0" name="image16.png"/>
                         <pic:cNvPicPr preferRelativeResize="0"/>
                       </pic:nvPicPr>
                       <pic:blipFill>
@@ -828,12 +828,12 @@
             <wp:extent cx="1200150" cy="1200150"/>
             <wp:effectExtent b="0" l="0" r="0" t="0"/>
             <wp:wrapSquare wrapText="bothSides" distB="0" distT="0" distL="114300" distR="114300"/>
-            <wp:docPr descr="psi-negro.png" id="18" name="image4.png"/>
+            <wp:docPr descr="psi-negro.png" id="19" name="image5.png"/>
             <a:graphic>
               <a:graphicData uri="http://schemas.openxmlformats.org/drawingml/2006/picture">
                 <pic:pic>
                   <pic:nvPicPr>
-                    <pic:cNvPr descr="psi-negro.png" id="0" name="image4.png"/>
+                    <pic:cNvPr descr="psi-negro.png" id="0" name="image5.png"/>
                     <pic:cNvPicPr preferRelativeResize="0"/>
                   </pic:nvPicPr>
                   <pic:blipFill>
@@ -883,12 +883,12 @@
             <wp:extent cx="1304925" cy="2019300"/>
             <wp:effectExtent b="0" l="0" r="0" t="0"/>
             <wp:wrapSquare wrapText="bothSides" distB="0" distT="0" distL="114300" distR="114300"/>
-            <wp:docPr descr="UNPA.JPG" id="13" name="image3.jpg"/>
+            <wp:docPr descr="UNPA.JPG" id="13" name="image1.jpg"/>
             <a:graphic>
               <a:graphicData uri="http://schemas.openxmlformats.org/drawingml/2006/picture">
                 <pic:pic>
                   <pic:nvPicPr>
-                    <pic:cNvPr descr="UNPA.JPG" id="0" name="image3.jpg"/>
+                    <pic:cNvPr descr="UNPA.JPG" id="0" name="image1.jpg"/>
                     <pic:cNvPicPr preferRelativeResize="0"/>
                   </pic:nvPicPr>
                   <pic:blipFill>
@@ -1098,12 +1098,12 @@
                 <wp:extent cx="2060575" cy="7330709"/>
                 <wp:effectExtent b="0" l="0" r="0" t="0"/>
                 <wp:wrapSquare wrapText="bothSides" distB="0" distT="0" distL="114300" distR="114300"/>
-                <wp:docPr id="1" name="image7.png"/>
+                <wp:docPr id="1" name="image8.png"/>
                 <a:graphic>
                   <a:graphicData uri="http://schemas.openxmlformats.org/drawingml/2006/picture">
                     <pic:pic>
                       <pic:nvPicPr>
-                        <pic:cNvPr id="0" name="image7.png"/>
+                        <pic:cNvPr id="0" name="image8.png"/>
                         <pic:cNvPicPr preferRelativeResize="0"/>
                       </pic:nvPicPr>
                       <pic:blipFill>
@@ -1204,12 +1204,12 @@
             <wp:extent cx="1200150" cy="1200150"/>
             <wp:effectExtent b="0" l="0" r="0" t="0"/>
             <wp:wrapSquare wrapText="bothSides" distB="0" distT="0" distL="114300" distR="114300"/>
-            <wp:docPr descr="psi-negro.png" id="12" name="image4.png"/>
+            <wp:docPr descr="psi-negro.png" id="12" name="image5.png"/>
             <a:graphic>
               <a:graphicData uri="http://schemas.openxmlformats.org/drawingml/2006/picture">
                 <pic:pic>
                   <pic:nvPicPr>
-                    <pic:cNvPr descr="psi-negro.png" id="0" name="image4.png"/>
+                    <pic:cNvPr descr="psi-negro.png" id="0" name="image5.png"/>
                     <pic:cNvPicPr preferRelativeResize="0"/>
                   </pic:nvPicPr>
                   <pic:blipFill>
@@ -1307,7 +1307,7 @@
     </w:p>
     <w:sdt>
       <w:sdtPr>
-        <w:id w:val="-1503217773"/>
+        <w:id w:val="-577899064"/>
         <w:docPartObj>
           <w:docPartGallery w:val="Table of Contents"/>
           <w:docPartUnique w:val="1"/>
@@ -4514,83 +4514,26 @@
           </w:p>
         </w:tc>
       </w:tr>
-      <w:tr>
-        <w:trPr>
-          <w:cantSplit w:val="0"/>
-          <w:trHeight w:val="885" w:hRule="atLeast"/>
-          <w:tblHeader w:val="0"/>
-        </w:trPr>
-        <w:tc>
-          <w:tcPr>
-            <w:tcBorders>
-              <w:top w:color="3d444d" w:space="0" w:sz="4" w:val="single"/>
-              <w:left w:color="3d444d" w:space="0" w:sz="4" w:val="single"/>
-              <w:bottom w:color="3d444d" w:space="0" w:sz="4" w:val="single"/>
-              <w:right w:color="3d444d" w:space="0" w:sz="4" w:val="single"/>
-            </w:tcBorders>
-            <w:tcMar>
-              <w:top w:w="100.0" w:type="dxa"/>
-              <w:left w:w="200.0" w:type="dxa"/>
-              <w:bottom w:w="100.0" w:type="dxa"/>
-              <w:right w:w="200.0" w:type="dxa"/>
-            </w:tcMar>
-            <w:vAlign w:val="top"/>
-          </w:tcPr>
-          <w:p>
-            <w:pPr>
-              <w:tabs>
-                <w:tab w:val="left" w:leader="none" w:pos="0"/>
-              </w:tabs>
-              <w:spacing w:before="0" w:line="240" w:lineRule="auto"/>
-              <w:ind w:left="0"/>
-              <w:rPr>
-                <w:b w:val="1"/>
-              </w:rPr>
-            </w:pPr>
-            <w:r>
-              <w:rPr>
-                <w:b w:val="1"/>
-                <w:rtl w:val="0"/>
-              </w:rPr>
-              <w:t xml:space="preserve">Toggl Track</w:t>
-            </w:r>
-          </w:p>
-        </w:tc>
-        <w:tc>
-          <w:tcPr>
-            <w:tcBorders>
-              <w:top w:color="3d444d" w:space="0" w:sz="4" w:val="single"/>
-              <w:left w:color="3d444d" w:space="0" w:sz="4" w:val="single"/>
-              <w:bottom w:color="3d444d" w:space="0" w:sz="4" w:val="single"/>
-              <w:right w:color="3d444d" w:space="0" w:sz="4" w:val="single"/>
-            </w:tcBorders>
-            <w:tcMar>
-              <w:top w:w="100.0" w:type="dxa"/>
-              <w:left w:w="200.0" w:type="dxa"/>
-              <w:bottom w:w="100.0" w:type="dxa"/>
-              <w:right w:w="200.0" w:type="dxa"/>
-            </w:tcMar>
-            <w:vAlign w:val="top"/>
-          </w:tcPr>
-          <w:p>
-            <w:pPr>
-              <w:tabs>
-                <w:tab w:val="left" w:leader="none" w:pos="0"/>
-              </w:tabs>
-              <w:spacing w:before="0" w:line="240" w:lineRule="auto"/>
-              <w:ind w:left="0"/>
-              <w:rPr/>
-            </w:pPr>
-            <w:r>
-              <w:rPr>
-                <w:rtl w:val="0"/>
-              </w:rPr>
-              <w:t xml:space="preserve">Servicio externo de seguimiento automático de tiempos integrado con el sistema.</w:t>
-            </w:r>
-          </w:p>
-        </w:tc>
-      </w:tr>
     </w:tbl>
+    <w:p>
+      <w:pPr>
+        <w:rPr>
+          <w:sz w:val="24"/>
+          <w:szCs w:val="24"/>
+        </w:rPr>
+      </w:pPr>
+      <w:r>
+        <w:rPr>
+          <w:rtl w:val="0"/>
+        </w:rPr>
+        <w:t xml:space="preserve">La versión anterior de este documento incluía la API de toggl track como actor del sistema; este se eliminó por decisión del equipo, ya que el registro de tiempos por cronómetro  será tomado directamente desde el sistema Kairos. </w:t>
+      </w:r>
+      <w:r>
+        <w:rPr>
+          <w:rtl w:val="0"/>
+        </w:rPr>
+      </w:r>
+    </w:p>
     <w:p>
       <w:pPr>
         <w:pStyle w:val="Heading3"/>
@@ -4931,9 +4874,58 @@
     </w:p>
     <w:p>
       <w:pPr>
-        <w:ind w:left="0" w:firstLine="0"/>
+        <w:pStyle w:val="Heading2"/>
+        <w:ind w:left="0"/>
         <w:rPr/>
       </w:pPr>
+      <w:bookmarkStart w:colFirst="0" w:colLast="0" w:name="_h5vwa7uosvxb" w:id="17"/>
+      <w:bookmarkEnd w:id="17"/>
+      <w:r>
+        <w:rPr>
+          <w:rtl w:val="0"/>
+        </w:rPr>
+        <w:t xml:space="preserve">Diagrama de Casos de uso</w:t>
+      </w:r>
+    </w:p>
+    <w:p>
+      <w:pPr>
+        <w:rPr/>
+      </w:pPr>
+      <w:r>
+        <w:rPr/>
+        <w:drawing>
+          <wp:inline distB="114300" distT="114300" distL="114300" distR="114300">
+            <wp:extent cx="5399730" cy="4343400"/>
+            <wp:effectExtent b="0" l="0" r="0" t="0"/>
+            <wp:docPr id="16" name="image4.png"/>
+            <a:graphic>
+              <a:graphicData uri="http://schemas.openxmlformats.org/drawingml/2006/picture">
+                <pic:pic>
+                  <pic:nvPicPr>
+                    <pic:cNvPr id="0" name="image4.png"/>
+                    <pic:cNvPicPr preferRelativeResize="0"/>
+                  </pic:nvPicPr>
+                  <pic:blipFill>
+                    <a:blip r:embed="rId9"/>
+                    <a:srcRect b="0" l="0" r="0" t="0"/>
+                    <a:stretch>
+                      <a:fillRect/>
+                    </a:stretch>
+                  </pic:blipFill>
+                  <pic:spPr>
+                    <a:xfrm>
+                      <a:off x="0" y="0"/>
+                      <a:ext cx="5399730" cy="4343400"/>
+                    </a:xfrm>
+                    <a:prstGeom prst="rect"/>
+                    <a:ln/>
+                  </pic:spPr>
+                </pic:pic>
+              </a:graphicData>
+            </a:graphic>
+          </wp:inline>
+        </w:drawing>
+      </w:r>
       <w:r>
         <w:rPr>
           <w:rtl w:val="0"/>
@@ -4949,8 +4941,8 @@
           <w:vertAlign w:val="baseline"/>
         </w:rPr>
       </w:pPr>
-      <w:bookmarkStart w:colFirst="0" w:colLast="0" w:name="_w6rkxf4xu8p3" w:id="17"/>
-      <w:bookmarkEnd w:id="17"/>
+      <w:bookmarkStart w:colFirst="0" w:colLast="0" w:name="_w6rkxf4xu8p3" w:id="18"/>
+      <w:bookmarkEnd w:id="18"/>
       <w:r>
         <w:rPr>
           <w:vertAlign w:val="baseline"/>
@@ -5040,8 +5032,8 @@
           <w:vertAlign w:val="baseline"/>
         </w:rPr>
       </w:pPr>
-      <w:bookmarkStart w:colFirst="0" w:colLast="0" w:name="_1j05jkby0ste" w:id="18"/>
-      <w:bookmarkEnd w:id="18"/>
+      <w:bookmarkStart w:colFirst="0" w:colLast="0" w:name="_1j05jkby0ste" w:id="19"/>
+      <w:bookmarkEnd w:id="19"/>
       <w:r>
         <w:rPr>
           <w:vertAlign w:val="baseline"/>
@@ -5143,8 +5135,8 @@
           <w:vertAlign w:val="baseline"/>
         </w:rPr>
       </w:pPr>
-      <w:bookmarkStart w:colFirst="0" w:colLast="0" w:name="_sf59cjkiid7j" w:id="19"/>
-      <w:bookmarkEnd w:id="19"/>
+      <w:bookmarkStart w:colFirst="0" w:colLast="0" w:name="_sf59cjkiid7j" w:id="20"/>
+      <w:bookmarkEnd w:id="20"/>
       <w:r>
         <w:rPr>
           <w:vertAlign w:val="baseline"/>
@@ -5364,8 +5356,8 @@
           <w:vertAlign w:val="baseline"/>
         </w:rPr>
       </w:pPr>
-      <w:bookmarkStart w:colFirst="0" w:colLast="0" w:name="_blhkfp3s41qc" w:id="20"/>
-      <w:bookmarkEnd w:id="20"/>
+      <w:bookmarkStart w:colFirst="0" w:colLast="0" w:name="_blhkfp3s41qc" w:id="21"/>
+      <w:bookmarkEnd w:id="21"/>
       <w:r>
         <w:rPr>
           <w:vertAlign w:val="baseline"/>
@@ -5847,8 +5839,8 @@
           <w:vertAlign w:val="baseline"/>
         </w:rPr>
       </w:pPr>
-      <w:bookmarkStart w:colFirst="0" w:colLast="0" w:name="_lyay6f36587s" w:id="21"/>
-      <w:bookmarkEnd w:id="21"/>
+      <w:bookmarkStart w:colFirst="0" w:colLast="0" w:name="_lyay6f36587s" w:id="22"/>
+      <w:bookmarkEnd w:id="22"/>
       <w:r>
         <w:rPr>
           <w:vertAlign w:val="baseline"/>
@@ -6598,8 +6590,8 @@
           <w:vertAlign w:val="baseline"/>
         </w:rPr>
       </w:pPr>
-      <w:bookmarkStart w:colFirst="0" w:colLast="0" w:name="_ym0a0cc9jm0" w:id="22"/>
-      <w:bookmarkEnd w:id="22"/>
+      <w:bookmarkStart w:colFirst="0" w:colLast="0" w:name="_ym0a0cc9jm0" w:id="23"/>
+      <w:bookmarkEnd w:id="23"/>
       <w:r>
         <w:rPr>
           <w:vertAlign w:val="baseline"/>
@@ -6743,8 +6735,8 @@
           <w:vertAlign w:val="baseline"/>
         </w:rPr>
       </w:pPr>
-      <w:bookmarkStart w:colFirst="0" w:colLast="0" w:name="_cvb8cydg74m9" w:id="23"/>
-      <w:bookmarkEnd w:id="23"/>
+      <w:bookmarkStart w:colFirst="0" w:colLast="0" w:name="_cvb8cydg74m9" w:id="24"/>
+      <w:bookmarkEnd w:id="24"/>
       <w:r>
         <w:rPr>
           <w:vertAlign w:val="baseline"/>
@@ -6912,8 +6904,8 @@
           <w:vertAlign w:val="baseline"/>
         </w:rPr>
       </w:pPr>
-      <w:bookmarkStart w:colFirst="0" w:colLast="0" w:name="_n57yxtebwpyn" w:id="24"/>
-      <w:bookmarkEnd w:id="24"/>
+      <w:bookmarkStart w:colFirst="0" w:colLast="0" w:name="_n57yxtebwpyn" w:id="25"/>
+      <w:bookmarkEnd w:id="25"/>
       <w:r>
         <w:rPr>
           <w:vertAlign w:val="baseline"/>
@@ -7066,8 +7058,8 @@
           <w:vertAlign w:val="baseline"/>
         </w:rPr>
       </w:pPr>
-      <w:bookmarkStart w:colFirst="0" w:colLast="0" w:name="_7805pnasfes" w:id="25"/>
-      <w:bookmarkEnd w:id="25"/>
+      <w:bookmarkStart w:colFirst="0" w:colLast="0" w:name="_7805pnasfes" w:id="26"/>
+      <w:bookmarkEnd w:id="26"/>
       <w:r>
         <w:rPr>
           <w:vertAlign w:val="baseline"/>
@@ -7085,8 +7077,8 @@
           <w:vertAlign w:val="baseline"/>
         </w:rPr>
       </w:pPr>
-      <w:bookmarkStart w:colFirst="0" w:colLast="0" w:name="_q5y08597mezs" w:id="26"/>
-      <w:bookmarkEnd w:id="26"/>
+      <w:bookmarkStart w:colFirst="0" w:colLast="0" w:name="_q5y08597mezs" w:id="27"/>
+      <w:bookmarkEnd w:id="27"/>
       <w:r>
         <w:rPr>
           <w:vertAlign w:val="baseline"/>
@@ -7109,16 +7101,16 @@
           <wp:inline distB="114300" distT="114300" distL="114300" distR="114300">
             <wp:extent cx="5399730" cy="2400300"/>
             <wp:effectExtent b="0" l="0" r="0" t="0"/>
-            <wp:docPr id="15" name="image6.png"/>
+            <wp:docPr id="15" name="image7.png"/>
             <a:graphic>
               <a:graphicData uri="http://schemas.openxmlformats.org/drawingml/2006/picture">
                 <pic:pic>
                   <pic:nvPicPr>
-                    <pic:cNvPr id="0" name="image6.png"/>
+                    <pic:cNvPr id="0" name="image7.png"/>
                     <pic:cNvPicPr preferRelativeResize="0"/>
                   </pic:nvPicPr>
                   <pic:blipFill>
-                    <a:blip r:embed="rId9"/>
+                    <a:blip r:embed="rId10"/>
                     <a:srcRect b="0" l="8" r="8" t="0"/>
                     <a:stretch>
                       <a:fillRect/>
@@ -7154,8 +7146,8 @@
           <w:color w:val="548dd4"/>
         </w:rPr>
       </w:pPr>
-      <w:bookmarkStart w:colFirst="0" w:colLast="0" w:name="_g8lkzod0eszb" w:id="27"/>
-      <w:bookmarkEnd w:id="27"/>
+      <w:bookmarkStart w:colFirst="0" w:colLast="0" w:name="_g8lkzod0eszb" w:id="28"/>
+      <w:bookmarkEnd w:id="28"/>
       <w:r>
         <w:rPr>
           <w:vertAlign w:val="baseline"/>
@@ -7252,16 +7244,16 @@
           <wp:inline distB="114300" distT="114300" distL="114300" distR="114300">
             <wp:extent cx="5399730" cy="3162300"/>
             <wp:effectExtent b="0" l="0" r="0" t="0"/>
-            <wp:docPr id="17" name="image5.png"/>
+            <wp:docPr id="18" name="image6.png"/>
             <a:graphic>
               <a:graphicData uri="http://schemas.openxmlformats.org/drawingml/2006/picture">
                 <pic:pic>
                   <pic:nvPicPr>
-                    <pic:cNvPr id="0" name="image5.png"/>
+                    <pic:cNvPr id="0" name="image6.png"/>
                     <pic:cNvPicPr preferRelativeResize="0"/>
                   </pic:nvPicPr>
                   <pic:blipFill>
-                    <a:blip r:embed="rId10"/>
+                    <a:blip r:embed="rId11"/>
                     <a:srcRect b="0" l="0" r="0" t="0"/>
                     <a:stretch>
                       <a:fillRect/>
@@ -7293,8 +7285,8 @@
         <w:ind w:left="0" w:firstLine="0"/>
         <w:rPr/>
       </w:pPr>
-      <w:bookmarkStart w:colFirst="0" w:colLast="0" w:name="_xfbvtxvcorkg" w:id="28"/>
-      <w:bookmarkEnd w:id="28"/>
+      <w:bookmarkStart w:colFirst="0" w:colLast="0" w:name="_xfbvtxvcorkg" w:id="29"/>
+      <w:bookmarkEnd w:id="29"/>
       <w:r>
         <w:rPr>
           <w:rtl w:val="0"/>
@@ -7302,8 +7294,8 @@
       </w:r>
     </w:p>
     <w:sectPr>
-      <w:headerReference r:id="rId11" w:type="default"/>
-      <w:footerReference r:id="rId12" w:type="default"/>
+      <w:headerReference r:id="rId12" w:type="default"/>
+      <w:footerReference r:id="rId13" w:type="default"/>
       <w:pgSz w:h="16838" w:w="11906" w:orient="portrait"/>
       <w:pgMar w:bottom="1417" w:top="1535" w:left="1701" w:right="1701" w:header="567" w:footer="572"/>
       <w:pgNumType w:start="1"/>
@@ -7528,12 +7520,12 @@
               <wp:extent cx="7761605" cy="822325"/>
               <wp:effectExtent b="0" l="0" r="0" t="0"/>
               <wp:wrapNone/>
-              <wp:docPr id="7" name="image13.png"/>
+              <wp:docPr id="7" name="image14.png"/>
               <a:graphic>
                 <a:graphicData uri="http://schemas.openxmlformats.org/drawingml/2006/picture">
                   <pic:pic>
                     <pic:nvPicPr>
-                      <pic:cNvPr id="0" name="image13.png"/>
+                      <pic:cNvPr id="0" name="image14.png"/>
                       <pic:cNvPicPr preferRelativeResize="0"/>
                     </pic:nvPicPr>
                     <pic:blipFill>
@@ -7635,12 +7627,12 @@
               <wp:extent cx="103505" cy="824865"/>
               <wp:effectExtent b="0" l="0" r="0" t="0"/>
               <wp:wrapNone/>
-              <wp:docPr id="3" name="image9.png"/>
+              <wp:docPr id="3" name="image10.png"/>
               <a:graphic>
                 <a:graphicData uri="http://schemas.openxmlformats.org/drawingml/2006/picture">
                   <pic:pic>
                     <pic:nvPicPr>
-                      <pic:cNvPr id="0" name="image9.png"/>
+                      <pic:cNvPr id="0" name="image10.png"/>
                       <pic:cNvPicPr preferRelativeResize="0"/>
                     </pic:nvPicPr>
                     <pic:blipFill>
@@ -7742,12 +7734,12 @@
               <wp:extent cx="103505" cy="824865"/>
               <wp:effectExtent b="0" l="0" r="0" t="0"/>
               <wp:wrapNone/>
-              <wp:docPr id="10" name="image16.png"/>
+              <wp:docPr id="10" name="image17.png"/>
               <a:graphic>
                 <a:graphicData uri="http://schemas.openxmlformats.org/drawingml/2006/picture">
                   <pic:pic>
                     <pic:nvPicPr>
-                      <pic:cNvPr id="0" name="image16.png"/>
+                      <pic:cNvPr id="0" name="image17.png"/>
                       <pic:cNvPicPr preferRelativeResize="0"/>
                     </pic:nvPicPr>
                     <pic:blipFill>
@@ -7847,12 +7839,12 @@
           <wp:extent cx="669290" cy="669290"/>
           <wp:effectExtent b="0" l="0" r="0" t="0"/>
           <wp:wrapSquare wrapText="bothSides" distB="0" distT="0" distL="114300" distR="114300"/>
-          <wp:docPr descr="psi-negro.png" id="14" name="image2.png"/>
+          <wp:docPr descr="psi-negro.png" id="14" name="image3.png"/>
           <a:graphic>
             <a:graphicData uri="http://schemas.openxmlformats.org/drawingml/2006/picture">
               <pic:pic>
                 <pic:nvPicPr>
-                  <pic:cNvPr descr="psi-negro.png" id="0" name="image2.png"/>
+                  <pic:cNvPr descr="psi-negro.png" id="0" name="image3.png"/>
                   <pic:cNvPicPr preferRelativeResize="0"/>
                 </pic:nvPicPr>
                 <pic:blipFill>
@@ -7892,12 +7884,12 @@
           <wp:extent cx="425450" cy="666750"/>
           <wp:effectExtent b="0" l="0" r="0" t="0"/>
           <wp:wrapSquare wrapText="bothSides" distB="0" distT="0" distL="114300" distR="114300"/>
-          <wp:docPr descr="UNPA.JPG" id="16" name="image1.jpg"/>
+          <wp:docPr descr="UNPA.JPG" id="17" name="image2.jpg"/>
           <a:graphic>
             <a:graphicData uri="http://schemas.openxmlformats.org/drawingml/2006/picture">
               <pic:pic>
                 <pic:nvPicPr>
-                  <pic:cNvPr descr="UNPA.JPG" id="0" name="image1.jpg"/>
+                  <pic:cNvPr descr="UNPA.JPG" id="0" name="image2.jpg"/>
                   <pic:cNvPicPr preferRelativeResize="0"/>
                 </pic:nvPicPr>
                 <pic:blipFill>
@@ -8000,12 +7992,12 @@
               <wp:extent cx="103505" cy="811530"/>
               <wp:effectExtent b="0" l="0" r="0" t="0"/>
               <wp:wrapNone/>
-              <wp:docPr id="8" name="image14.png"/>
+              <wp:docPr id="8" name="image15.png"/>
               <a:graphic>
                 <a:graphicData uri="http://schemas.openxmlformats.org/drawingml/2006/picture">
                   <pic:pic>
                     <pic:nvPicPr>
-                      <pic:cNvPr id="0" name="image14.png"/>
+                      <pic:cNvPr id="0" name="image15.png"/>
                       <pic:cNvPicPr preferRelativeResize="0"/>
                     </pic:nvPicPr>
                     <pic:blipFill>
@@ -8110,12 +8102,12 @@
               <wp:extent cx="103505" cy="812165"/>
               <wp:effectExtent b="0" l="0" r="0" t="0"/>
               <wp:wrapNone/>
-              <wp:docPr id="5" name="image11.png"/>
+              <wp:docPr id="5" name="image12.png"/>
               <a:graphic>
                 <a:graphicData uri="http://schemas.openxmlformats.org/drawingml/2006/picture">
                   <pic:pic>
                     <pic:nvPicPr>
-                      <pic:cNvPr id="0" name="image11.png"/>
+                      <pic:cNvPr id="0" name="image12.png"/>
                       <pic:cNvPicPr preferRelativeResize="0"/>
                     </pic:nvPicPr>
                     <pic:blipFill>
@@ -8311,12 +8303,12 @@
               <wp:extent cx="7549515" cy="815340"/>
               <wp:effectExtent b="0" l="0" r="0" t="0"/>
               <wp:wrapNone/>
-              <wp:docPr id="4" name="image10.png"/>
+              <wp:docPr id="4" name="image11.png"/>
               <a:graphic>
                 <a:graphicData uri="http://schemas.openxmlformats.org/drawingml/2006/picture">
                   <pic:pic>
                     <pic:nvPicPr>
-                      <pic:cNvPr id="0" name="image10.png"/>
+                      <pic:cNvPr id="0" name="image11.png"/>
                       <pic:cNvPicPr preferRelativeResize="0"/>
                     </pic:nvPicPr>
                     <pic:blipFill>

</xml_diff>

<commit_message>
docs: casos de prueba e implementacion
</commit_message>
<xml_diff>
--- a/Etapa Construcción - Iteración 1/Arquitectura del Sistema - Kairos - NexTech.docx
+++ b/Etapa Construcción - Iteración 1/Arquitectura del Sistema - Kairos - NexTech.docx
@@ -828,12 +828,12 @@
             <wp:extent cx="1200150" cy="1200150"/>
             <wp:effectExtent b="0" l="0" r="0" t="0"/>
             <wp:wrapSquare wrapText="bothSides" distB="0" distT="0" distL="114300" distR="114300"/>
-            <wp:docPr descr="psi-negro.png" id="19" name="image5.png"/>
+            <wp:docPr descr="psi-negro.png" id="19" name="image4.png"/>
             <a:graphic>
               <a:graphicData uri="http://schemas.openxmlformats.org/drawingml/2006/picture">
                 <pic:pic>
                   <pic:nvPicPr>
-                    <pic:cNvPr descr="psi-negro.png" id="0" name="image5.png"/>
+                    <pic:cNvPr descr="psi-negro.png" id="0" name="image4.png"/>
                     <pic:cNvPicPr preferRelativeResize="0"/>
                   </pic:nvPicPr>
                   <pic:blipFill>
@@ -883,12 +883,12 @@
             <wp:extent cx="1304925" cy="2019300"/>
             <wp:effectExtent b="0" l="0" r="0" t="0"/>
             <wp:wrapSquare wrapText="bothSides" distB="0" distT="0" distL="114300" distR="114300"/>
-            <wp:docPr descr="UNPA.JPG" id="13" name="image1.jpg"/>
+            <wp:docPr descr="UNPA.JPG" id="13" name="image3.jpg"/>
             <a:graphic>
               <a:graphicData uri="http://schemas.openxmlformats.org/drawingml/2006/picture">
                 <pic:pic>
                   <pic:nvPicPr>
-                    <pic:cNvPr descr="UNPA.JPG" id="0" name="image1.jpg"/>
+                    <pic:cNvPr descr="UNPA.JPG" id="0" name="image3.jpg"/>
                     <pic:cNvPicPr preferRelativeResize="0"/>
                   </pic:nvPicPr>
                   <pic:blipFill>
@@ -1204,12 +1204,12 @@
             <wp:extent cx="1200150" cy="1200150"/>
             <wp:effectExtent b="0" l="0" r="0" t="0"/>
             <wp:wrapSquare wrapText="bothSides" distB="0" distT="0" distL="114300" distR="114300"/>
-            <wp:docPr descr="psi-negro.png" id="12" name="image5.png"/>
+            <wp:docPr descr="psi-negro.png" id="12" name="image4.png"/>
             <a:graphic>
               <a:graphicData uri="http://schemas.openxmlformats.org/drawingml/2006/picture">
                 <pic:pic>
                   <pic:nvPicPr>
-                    <pic:cNvPr descr="psi-negro.png" id="0" name="image5.png"/>
+                    <pic:cNvPr descr="psi-negro.png" id="0" name="image4.png"/>
                     <pic:cNvPicPr preferRelativeResize="0"/>
                   </pic:nvPicPr>
                   <pic:blipFill>
@@ -1307,7 +1307,7 @@
     </w:p>
     <w:sdt>
       <w:sdtPr>
-        <w:id w:val="-577899064"/>
+        <w:id w:val="-1688261659"/>
         <w:docPartObj>
           <w:docPartGallery w:val="Table of Contents"/>
           <w:docPartUnique w:val="1"/>
@@ -4897,12 +4897,12 @@
           <wp:inline distB="114300" distT="114300" distL="114300" distR="114300">
             <wp:extent cx="5399730" cy="4343400"/>
             <wp:effectExtent b="0" l="0" r="0" t="0"/>
-            <wp:docPr id="16" name="image4.png"/>
+            <wp:docPr id="16" name="image6.png"/>
             <a:graphic>
               <a:graphicData uri="http://schemas.openxmlformats.org/drawingml/2006/picture">
                 <pic:pic>
                   <pic:nvPicPr>
-                    <pic:cNvPr id="0" name="image4.png"/>
+                    <pic:cNvPr id="0" name="image6.png"/>
                     <pic:cNvPicPr preferRelativeResize="0"/>
                   </pic:nvPicPr>
                   <pic:blipFill>
@@ -7244,12 +7244,12 @@
           <wp:inline distB="114300" distT="114300" distL="114300" distR="114300">
             <wp:extent cx="5399730" cy="3162300"/>
             <wp:effectExtent b="0" l="0" r="0" t="0"/>
-            <wp:docPr id="18" name="image6.png"/>
+            <wp:docPr id="18" name="image5.png"/>
             <a:graphic>
               <a:graphicData uri="http://schemas.openxmlformats.org/drawingml/2006/picture">
                 <pic:pic>
                   <pic:nvPicPr>
-                    <pic:cNvPr id="0" name="image6.png"/>
+                    <pic:cNvPr id="0" name="image5.png"/>
                     <pic:cNvPicPr preferRelativeResize="0"/>
                   </pic:nvPicPr>
                   <pic:blipFill>
@@ -7839,12 +7839,12 @@
           <wp:extent cx="669290" cy="669290"/>
           <wp:effectExtent b="0" l="0" r="0" t="0"/>
           <wp:wrapSquare wrapText="bothSides" distB="0" distT="0" distL="114300" distR="114300"/>
-          <wp:docPr descr="psi-negro.png" id="14" name="image3.png"/>
+          <wp:docPr descr="psi-negro.png" id="14" name="image2.png"/>
           <a:graphic>
             <a:graphicData uri="http://schemas.openxmlformats.org/drawingml/2006/picture">
               <pic:pic>
                 <pic:nvPicPr>
-                  <pic:cNvPr descr="psi-negro.png" id="0" name="image3.png"/>
+                  <pic:cNvPr descr="psi-negro.png" id="0" name="image2.png"/>
                   <pic:cNvPicPr preferRelativeResize="0"/>
                 </pic:nvPicPr>
                 <pic:blipFill>
@@ -7884,12 +7884,12 @@
           <wp:extent cx="425450" cy="666750"/>
           <wp:effectExtent b="0" l="0" r="0" t="0"/>
           <wp:wrapSquare wrapText="bothSides" distB="0" distT="0" distL="114300" distR="114300"/>
-          <wp:docPr descr="UNPA.JPG" id="17" name="image2.jpg"/>
+          <wp:docPr descr="UNPA.JPG" id="17" name="image1.jpg"/>
           <a:graphic>
             <a:graphicData uri="http://schemas.openxmlformats.org/drawingml/2006/picture">
               <pic:pic>
                 <pic:nvPicPr>
-                  <pic:cNvPr descr="UNPA.JPG" id="0" name="image2.jpg"/>
+                  <pic:cNvPr descr="UNPA.JPG" id="0" name="image1.jpg"/>
                   <pic:cNvPicPr preferRelativeResize="0"/>
                 </pic:nvPicPr>
                 <pic:blipFill>

</xml_diff>

<commit_message>
docs: especificacion CU21 finalizado, documentos actualizados 31-10
</commit_message>
<xml_diff>
--- a/Etapa Construcción - Iteración 1/Arquitectura del Sistema - Kairos - NexTech.docx
+++ b/Etapa Construcción - Iteración 1/Arquitectura del Sistema - Kairos - NexTech.docx
@@ -828,12 +828,12 @@
             <wp:extent cx="1200150" cy="1200150"/>
             <wp:effectExtent b="0" l="0" r="0" t="0"/>
             <wp:wrapSquare wrapText="bothSides" distB="0" distT="0" distL="114300" distR="114300"/>
-            <wp:docPr descr="psi-negro.png" id="19" name="image1.png"/>
+            <wp:docPr descr="psi-negro.png" id="19" name="image4.png"/>
             <a:graphic>
               <a:graphicData uri="http://schemas.openxmlformats.org/drawingml/2006/picture">
                 <pic:pic>
                   <pic:nvPicPr>
-                    <pic:cNvPr descr="psi-negro.png" id="0" name="image1.png"/>
+                    <pic:cNvPr descr="psi-negro.png" id="0" name="image4.png"/>
                     <pic:cNvPicPr preferRelativeResize="0"/>
                   </pic:nvPicPr>
                   <pic:blipFill>
@@ -883,12 +883,12 @@
             <wp:extent cx="1304925" cy="2019300"/>
             <wp:effectExtent b="0" l="0" r="0" t="0"/>
             <wp:wrapSquare wrapText="bothSides" distB="0" distT="0" distL="114300" distR="114300"/>
-            <wp:docPr descr="UNPA.JPG" id="13" name="image2.jpg"/>
+            <wp:docPr descr="UNPA.JPG" id="13" name="image3.jpg"/>
             <a:graphic>
               <a:graphicData uri="http://schemas.openxmlformats.org/drawingml/2006/picture">
                 <pic:pic>
                   <pic:nvPicPr>
-                    <pic:cNvPr descr="UNPA.JPG" id="0" name="image2.jpg"/>
+                    <pic:cNvPr descr="UNPA.JPG" id="0" name="image3.jpg"/>
                     <pic:cNvPicPr preferRelativeResize="0"/>
                   </pic:nvPicPr>
                   <pic:blipFill>
@@ -1204,12 +1204,12 @@
             <wp:extent cx="1200150" cy="1200150"/>
             <wp:effectExtent b="0" l="0" r="0" t="0"/>
             <wp:wrapSquare wrapText="bothSides" distB="0" distT="0" distL="114300" distR="114300"/>
-            <wp:docPr descr="psi-negro.png" id="12" name="image1.png"/>
+            <wp:docPr descr="psi-negro.png" id="12" name="image4.png"/>
             <a:graphic>
               <a:graphicData uri="http://schemas.openxmlformats.org/drawingml/2006/picture">
                 <pic:pic>
                   <pic:nvPicPr>
-                    <pic:cNvPr descr="psi-negro.png" id="0" name="image1.png"/>
+                    <pic:cNvPr descr="psi-negro.png" id="0" name="image4.png"/>
                     <pic:cNvPicPr preferRelativeResize="0"/>
                   </pic:nvPicPr>
                   <pic:blipFill>
@@ -1307,7 +1307,7 @@
     </w:p>
     <w:sdt>
       <w:sdtPr>
-        <w:id w:val="1982529734"/>
+        <w:id w:val="-643334569"/>
         <w:docPartObj>
           <w:docPartGallery w:val="Table of Contents"/>
           <w:docPartUnique w:val="1"/>
@@ -4897,12 +4897,12 @@
           <wp:inline distB="114300" distT="114300" distL="114300" distR="114300">
             <wp:extent cx="5399730" cy="4343400"/>
             <wp:effectExtent b="0" l="0" r="0" t="0"/>
-            <wp:docPr id="16" name="image6.png"/>
+            <wp:docPr id="16" name="image5.png"/>
             <a:graphic>
               <a:graphicData uri="http://schemas.openxmlformats.org/drawingml/2006/picture">
                 <pic:pic>
                   <pic:nvPicPr>
-                    <pic:cNvPr id="0" name="image6.png"/>
+                    <pic:cNvPr id="0" name="image5.png"/>
                     <pic:cNvPicPr preferRelativeResize="0"/>
                   </pic:nvPicPr>
                   <pic:blipFill>
@@ -7244,12 +7244,12 @@
           <wp:inline distB="114300" distT="114300" distL="114300" distR="114300">
             <wp:extent cx="5399730" cy="3162300"/>
             <wp:effectExtent b="0" l="0" r="0" t="0"/>
-            <wp:docPr id="18" name="image5.png"/>
+            <wp:docPr id="18" name="image6.png"/>
             <a:graphic>
               <a:graphicData uri="http://schemas.openxmlformats.org/drawingml/2006/picture">
                 <pic:pic>
                   <pic:nvPicPr>
-                    <pic:cNvPr id="0" name="image5.png"/>
+                    <pic:cNvPr id="0" name="image6.png"/>
                     <pic:cNvPicPr preferRelativeResize="0"/>
                   </pic:nvPicPr>
                   <pic:blipFill>
@@ -7839,12 +7839,12 @@
           <wp:extent cx="669290" cy="669290"/>
           <wp:effectExtent b="0" l="0" r="0" t="0"/>
           <wp:wrapSquare wrapText="bothSides" distB="0" distT="0" distL="114300" distR="114300"/>
-          <wp:docPr descr="psi-negro.png" id="14" name="image4.png"/>
+          <wp:docPr descr="psi-negro.png" id="14" name="image1.png"/>
           <a:graphic>
             <a:graphicData uri="http://schemas.openxmlformats.org/drawingml/2006/picture">
               <pic:pic>
                 <pic:nvPicPr>
-                  <pic:cNvPr descr="psi-negro.png" id="0" name="image4.png"/>
+                  <pic:cNvPr descr="psi-negro.png" id="0" name="image1.png"/>
                   <pic:cNvPicPr preferRelativeResize="0"/>
                 </pic:nvPicPr>
                 <pic:blipFill>
@@ -7884,12 +7884,12 @@
           <wp:extent cx="425450" cy="666750"/>
           <wp:effectExtent b="0" l="0" r="0" t="0"/>
           <wp:wrapSquare wrapText="bothSides" distB="0" distT="0" distL="114300" distR="114300"/>
-          <wp:docPr descr="UNPA.JPG" id="17" name="image3.jpg"/>
+          <wp:docPr descr="UNPA.JPG" id="17" name="image2.jpg"/>
           <a:graphic>
             <a:graphicData uri="http://schemas.openxmlformats.org/drawingml/2006/picture">
               <pic:pic>
                 <pic:nvPicPr>
-                  <pic:cNvPr descr="UNPA.JPG" id="0" name="image3.jpg"/>
+                  <pic:cNvPr descr="UNPA.JPG" id="0" name="image2.jpg"/>
                   <pic:cNvPicPr preferRelativeResize="0"/>
                 </pic:nvPicPr>
                 <pic:blipFill>

</xml_diff>

<commit_message>
docs: inicio documento casos de prueba de CU 07, 13, 14
</commit_message>
<xml_diff>
--- a/Etapa Construcción - Iteración 1/Arquitectura del Sistema - Kairos - NexTech.docx
+++ b/Etapa Construcción - Iteración 1/Arquitectura del Sistema - Kairos - NexTech.docx
@@ -1307,7 +1307,7 @@
     </w:p>
     <w:sdt>
       <w:sdtPr>
-        <w:id w:val="-643334569"/>
+        <w:id w:val="-93187763"/>
         <w:docPartObj>
           <w:docPartGallery w:val="Table of Contents"/>
           <w:docPartUnique w:val="1"/>
@@ -4897,12 +4897,12 @@
           <wp:inline distB="114300" distT="114300" distL="114300" distR="114300">
             <wp:extent cx="5399730" cy="4343400"/>
             <wp:effectExtent b="0" l="0" r="0" t="0"/>
-            <wp:docPr id="16" name="image5.png"/>
+            <wp:docPr id="16" name="image6.png"/>
             <a:graphic>
               <a:graphicData uri="http://schemas.openxmlformats.org/drawingml/2006/picture">
                 <pic:pic>
                   <pic:nvPicPr>
-                    <pic:cNvPr id="0" name="image5.png"/>
+                    <pic:cNvPr id="0" name="image6.png"/>
                     <pic:cNvPicPr preferRelativeResize="0"/>
                   </pic:nvPicPr>
                   <pic:blipFill>
@@ -7244,12 +7244,12 @@
           <wp:inline distB="114300" distT="114300" distL="114300" distR="114300">
             <wp:extent cx="5399730" cy="3162300"/>
             <wp:effectExtent b="0" l="0" r="0" t="0"/>
-            <wp:docPr id="18" name="image6.png"/>
+            <wp:docPr id="18" name="image5.png"/>
             <a:graphic>
               <a:graphicData uri="http://schemas.openxmlformats.org/drawingml/2006/picture">
                 <pic:pic>
                   <pic:nvPicPr>
-                    <pic:cNvPr id="0" name="image6.png"/>
+                    <pic:cNvPr id="0" name="image5.png"/>
                     <pic:cNvPicPr preferRelativeResize="0"/>
                   </pic:nvPicPr>
                   <pic:blipFill>

</xml_diff>

<commit_message>
docs: especificaciones y casos de prueba
</commit_message>
<xml_diff>
--- a/Etapa Construcción - Iteración 1/Arquitectura del Sistema - Kairos - NexTech.docx
+++ b/Etapa Construcción - Iteración 1/Arquitectura del Sistema - Kairos - NexTech.docx
@@ -828,12 +828,12 @@
             <wp:extent cx="1200150" cy="1200150"/>
             <wp:effectExtent b="0" l="0" r="0" t="0"/>
             <wp:wrapSquare wrapText="bothSides" distB="0" distT="0" distL="114300" distR="114300"/>
-            <wp:docPr descr="psi-negro.png" id="19" name="image4.png"/>
+            <wp:docPr descr="psi-negro.png" id="19" name="image1.png"/>
             <a:graphic>
               <a:graphicData uri="http://schemas.openxmlformats.org/drawingml/2006/picture">
                 <pic:pic>
                   <pic:nvPicPr>
-                    <pic:cNvPr descr="psi-negro.png" id="0" name="image4.png"/>
+                    <pic:cNvPr descr="psi-negro.png" id="0" name="image1.png"/>
                     <pic:cNvPicPr preferRelativeResize="0"/>
                   </pic:nvPicPr>
                   <pic:blipFill>
@@ -1204,12 +1204,12 @@
             <wp:extent cx="1200150" cy="1200150"/>
             <wp:effectExtent b="0" l="0" r="0" t="0"/>
             <wp:wrapSquare wrapText="bothSides" distB="0" distT="0" distL="114300" distR="114300"/>
-            <wp:docPr descr="psi-negro.png" id="12" name="image4.png"/>
+            <wp:docPr descr="psi-negro.png" id="12" name="image1.png"/>
             <a:graphic>
               <a:graphicData uri="http://schemas.openxmlformats.org/drawingml/2006/picture">
                 <pic:pic>
                   <pic:nvPicPr>
-                    <pic:cNvPr descr="psi-negro.png" id="0" name="image4.png"/>
+                    <pic:cNvPr descr="psi-negro.png" id="0" name="image1.png"/>
                     <pic:cNvPicPr preferRelativeResize="0"/>
                   </pic:nvPicPr>
                   <pic:blipFill>
@@ -1307,7 +1307,7 @@
     </w:p>
     <w:sdt>
       <w:sdtPr>
-        <w:id w:val="-93187763"/>
+        <w:id w:val="1743340501"/>
         <w:docPartObj>
           <w:docPartGallery w:val="Table of Contents"/>
           <w:docPartUnique w:val="1"/>
@@ -7839,12 +7839,12 @@
           <wp:extent cx="669290" cy="669290"/>
           <wp:effectExtent b="0" l="0" r="0" t="0"/>
           <wp:wrapSquare wrapText="bothSides" distB="0" distT="0" distL="114300" distR="114300"/>
-          <wp:docPr descr="psi-negro.png" id="14" name="image1.png"/>
+          <wp:docPr descr="psi-negro.png" id="14" name="image2.png"/>
           <a:graphic>
             <a:graphicData uri="http://schemas.openxmlformats.org/drawingml/2006/picture">
               <pic:pic>
                 <pic:nvPicPr>
-                  <pic:cNvPr descr="psi-negro.png" id="0" name="image1.png"/>
+                  <pic:cNvPr descr="psi-negro.png" id="0" name="image2.png"/>
                   <pic:cNvPicPr preferRelativeResize="0"/>
                 </pic:nvPicPr>
                 <pic:blipFill>
@@ -7884,12 +7884,12 @@
           <wp:extent cx="425450" cy="666750"/>
           <wp:effectExtent b="0" l="0" r="0" t="0"/>
           <wp:wrapSquare wrapText="bothSides" distB="0" distT="0" distL="114300" distR="114300"/>
-          <wp:docPr descr="UNPA.JPG" id="17" name="image2.jpg"/>
+          <wp:docPr descr="UNPA.JPG" id="17" name="image4.jpg"/>
           <a:graphic>
             <a:graphicData uri="http://schemas.openxmlformats.org/drawingml/2006/picture">
               <pic:pic>
                 <pic:nvPicPr>
-                  <pic:cNvPr descr="UNPA.JPG" id="0" name="image2.jpg"/>
+                  <pic:cNvPr descr="UNPA.JPG" id="0" name="image4.jpg"/>
                   <pic:cNvPicPr preferRelativeResize="0"/>
                 </pic:nvPicPr>
                 <pic:blipFill>

</xml_diff>

<commit_message>
docs: casos de pruebas avanzados
</commit_message>
<xml_diff>
--- a/Etapa Construcción - Iteración 1/Arquitectura del Sistema - Kairos - NexTech.docx
+++ b/Etapa Construcción - Iteración 1/Arquitectura del Sistema - Kairos - NexTech.docx
@@ -828,12 +828,12 @@
             <wp:extent cx="1200150" cy="1200150"/>
             <wp:effectExtent b="0" l="0" r="0" t="0"/>
             <wp:wrapSquare wrapText="bothSides" distB="0" distT="0" distL="114300" distR="114300"/>
-            <wp:docPr descr="psi-negro.png" id="19" name="image1.png"/>
+            <wp:docPr descr="psi-negro.png" id="19" name="image2.png"/>
             <a:graphic>
               <a:graphicData uri="http://schemas.openxmlformats.org/drawingml/2006/picture">
                 <pic:pic>
                   <pic:nvPicPr>
-                    <pic:cNvPr descr="psi-negro.png" id="0" name="image1.png"/>
+                    <pic:cNvPr descr="psi-negro.png" id="0" name="image2.png"/>
                     <pic:cNvPicPr preferRelativeResize="0"/>
                   </pic:nvPicPr>
                   <pic:blipFill>
@@ -883,12 +883,12 @@
             <wp:extent cx="1304925" cy="2019300"/>
             <wp:effectExtent b="0" l="0" r="0" t="0"/>
             <wp:wrapSquare wrapText="bothSides" distB="0" distT="0" distL="114300" distR="114300"/>
-            <wp:docPr descr="UNPA.JPG" id="13" name="image3.jpg"/>
+            <wp:docPr descr="UNPA.JPG" id="13" name="image1.jpg"/>
             <a:graphic>
               <a:graphicData uri="http://schemas.openxmlformats.org/drawingml/2006/picture">
                 <pic:pic>
                   <pic:nvPicPr>
-                    <pic:cNvPr descr="UNPA.JPG" id="0" name="image3.jpg"/>
+                    <pic:cNvPr descr="UNPA.JPG" id="0" name="image1.jpg"/>
                     <pic:cNvPicPr preferRelativeResize="0"/>
                   </pic:nvPicPr>
                   <pic:blipFill>
@@ -1204,12 +1204,12 @@
             <wp:extent cx="1200150" cy="1200150"/>
             <wp:effectExtent b="0" l="0" r="0" t="0"/>
             <wp:wrapSquare wrapText="bothSides" distB="0" distT="0" distL="114300" distR="114300"/>
-            <wp:docPr descr="psi-negro.png" id="12" name="image1.png"/>
+            <wp:docPr descr="psi-negro.png" id="12" name="image2.png"/>
             <a:graphic>
               <a:graphicData uri="http://schemas.openxmlformats.org/drawingml/2006/picture">
                 <pic:pic>
                   <pic:nvPicPr>
-                    <pic:cNvPr descr="psi-negro.png" id="0" name="image1.png"/>
+                    <pic:cNvPr descr="psi-negro.png" id="0" name="image2.png"/>
                     <pic:cNvPicPr preferRelativeResize="0"/>
                   </pic:nvPicPr>
                   <pic:blipFill>
@@ -1307,7 +1307,7 @@
     </w:p>
     <w:sdt>
       <w:sdtPr>
-        <w:id w:val="1743340501"/>
+        <w:id w:val="-2144527663"/>
         <w:docPartObj>
           <w:docPartGallery w:val="Table of Contents"/>
           <w:docPartUnique w:val="1"/>
@@ -4897,12 +4897,12 @@
           <wp:inline distB="114300" distT="114300" distL="114300" distR="114300">
             <wp:extent cx="5399730" cy="4343400"/>
             <wp:effectExtent b="0" l="0" r="0" t="0"/>
-            <wp:docPr id="16" name="image6.png"/>
+            <wp:docPr id="16" name="image5.png"/>
             <a:graphic>
               <a:graphicData uri="http://schemas.openxmlformats.org/drawingml/2006/picture">
                 <pic:pic>
                   <pic:nvPicPr>
-                    <pic:cNvPr id="0" name="image6.png"/>
+                    <pic:cNvPr id="0" name="image5.png"/>
                     <pic:cNvPicPr preferRelativeResize="0"/>
                   </pic:nvPicPr>
                   <pic:blipFill>
@@ -7101,12 +7101,12 @@
           <wp:inline distB="114300" distT="114300" distL="114300" distR="114300">
             <wp:extent cx="5399730" cy="2400300"/>
             <wp:effectExtent b="0" l="0" r="0" t="0"/>
-            <wp:docPr id="15" name="image7.png"/>
+            <wp:docPr id="15" name="image6.png"/>
             <a:graphic>
               <a:graphicData uri="http://schemas.openxmlformats.org/drawingml/2006/picture">
                 <pic:pic>
                   <pic:nvPicPr>
-                    <pic:cNvPr id="0" name="image7.png"/>
+                    <pic:cNvPr id="0" name="image6.png"/>
                     <pic:cNvPicPr preferRelativeResize="0"/>
                   </pic:nvPicPr>
                   <pic:blipFill>
@@ -7244,12 +7244,12 @@
           <wp:inline distB="114300" distT="114300" distL="114300" distR="114300">
             <wp:extent cx="5399730" cy="3162300"/>
             <wp:effectExtent b="0" l="0" r="0" t="0"/>
-            <wp:docPr id="18" name="image5.png"/>
+            <wp:docPr id="18" name="image7.png"/>
             <a:graphic>
               <a:graphicData uri="http://schemas.openxmlformats.org/drawingml/2006/picture">
                 <pic:pic>
                   <pic:nvPicPr>
-                    <pic:cNvPr id="0" name="image5.png"/>
+                    <pic:cNvPr id="0" name="image7.png"/>
                     <pic:cNvPicPr preferRelativeResize="0"/>
                   </pic:nvPicPr>
                   <pic:blipFill>
@@ -7839,12 +7839,12 @@
           <wp:extent cx="669290" cy="669290"/>
           <wp:effectExtent b="0" l="0" r="0" t="0"/>
           <wp:wrapSquare wrapText="bothSides" distB="0" distT="0" distL="114300" distR="114300"/>
-          <wp:docPr descr="psi-negro.png" id="14" name="image2.png"/>
+          <wp:docPr descr="psi-negro.png" id="14" name="image3.png"/>
           <a:graphic>
             <a:graphicData uri="http://schemas.openxmlformats.org/drawingml/2006/picture">
               <pic:pic>
                 <pic:nvPicPr>
-                  <pic:cNvPr descr="psi-negro.png" id="0" name="image2.png"/>
+                  <pic:cNvPr descr="psi-negro.png" id="0" name="image3.png"/>
                   <pic:cNvPicPr preferRelativeResize="0"/>
                 </pic:nvPicPr>
                 <pic:blipFill>

</xml_diff>

<commit_message>
docs: inicio estructura de memoria del proyecto
</commit_message>
<xml_diff>
--- a/Etapa Construcción - Iteración 1/Arquitectura del Sistema - Kairos - NexTech.docx
+++ b/Etapa Construcción - Iteración 1/Arquitectura del Sistema - Kairos - NexTech.docx
@@ -849,12 +849,12 @@
             <wp:extent cx="1200150" cy="1200150"/>
             <wp:effectExtent b="0" l="0" r="0" t="0"/>
             <wp:wrapSquare wrapText="bothSides" distB="0" distT="0" distL="114300" distR="114300"/>
-            <wp:docPr descr="psi-negro.png" id="19" name="image1.png"/>
+            <wp:docPr descr="psi-negro.png" id="19" name="image3.png"/>
             <a:graphic>
               <a:graphicData uri="http://schemas.openxmlformats.org/drawingml/2006/picture">
                 <pic:pic>
                   <pic:nvPicPr>
-                    <pic:cNvPr descr="psi-negro.png" id="0" name="image1.png"/>
+                    <pic:cNvPr descr="psi-negro.png" id="0" name="image3.png"/>
                     <pic:cNvPicPr preferRelativeResize="0"/>
                   </pic:nvPicPr>
                   <pic:blipFill>
@@ -906,12 +906,12 @@
             <wp:extent cx="1304925" cy="2019300"/>
             <wp:effectExtent b="0" l="0" r="0" t="0"/>
             <wp:wrapSquare wrapText="bothSides" distB="0" distT="0" distL="114300" distR="114300"/>
-            <wp:docPr descr="UNPA.JPG" id="13" name="image4.jpg"/>
+            <wp:docPr descr="UNPA.JPG" id="13" name="image2.jpg"/>
             <a:graphic>
               <a:graphicData uri="http://schemas.openxmlformats.org/drawingml/2006/picture">
                 <pic:pic>
                   <pic:nvPicPr>
-                    <pic:cNvPr descr="UNPA.JPG" id="0" name="image4.jpg"/>
+                    <pic:cNvPr descr="UNPA.JPG" id="0" name="image2.jpg"/>
                     <pic:cNvPicPr preferRelativeResize="0"/>
                   </pic:nvPicPr>
                   <pic:blipFill>
@@ -1232,12 +1232,12 @@
             <wp:extent cx="1200150" cy="1200150"/>
             <wp:effectExtent b="0" l="0" r="0" t="0"/>
             <wp:wrapSquare wrapText="bothSides" distB="0" distT="0" distL="114300" distR="114300"/>
-            <wp:docPr descr="psi-negro.png" id="12" name="image1.png"/>
+            <wp:docPr descr="psi-negro.png" id="12" name="image3.png"/>
             <a:graphic>
               <a:graphicData uri="http://schemas.openxmlformats.org/drawingml/2006/picture">
                 <pic:pic>
                   <pic:nvPicPr>
-                    <pic:cNvPr descr="psi-negro.png" id="0" name="image1.png"/>
+                    <pic:cNvPr descr="psi-negro.png" id="0" name="image3.png"/>
                     <pic:cNvPicPr preferRelativeResize="0"/>
                   </pic:nvPicPr>
                   <pic:blipFill>
@@ -1339,7 +1339,7 @@
     </w:p>
     <w:sdt>
       <w:sdtPr>
-        <w:id w:val="463337202"/>
+        <w:id w:val="1390231253"/>
         <w:docPartObj>
           <w:docPartGallery w:val="Table of Contents"/>
           <w:docPartUnique w:val="1"/>
@@ -7290,12 +7290,12 @@
           <wp:inline distB="114300" distT="114300" distL="114300" distR="114300">
             <wp:extent cx="5399730" cy="2400300"/>
             <wp:effectExtent b="0" l="0" r="0" t="0"/>
-            <wp:docPr id="15" name="image5.png"/>
+            <wp:docPr id="15" name="image6.png"/>
             <a:graphic>
               <a:graphicData uri="http://schemas.openxmlformats.org/drawingml/2006/picture">
                 <pic:pic>
                   <pic:nvPicPr>
-                    <pic:cNvPr id="0" name="image5.png"/>
+                    <pic:cNvPr id="0" name="image6.png"/>
                     <pic:cNvPicPr preferRelativeResize="0"/>
                   </pic:nvPicPr>
                   <pic:blipFill>
@@ -7439,12 +7439,12 @@
           <wp:inline distB="114300" distT="114300" distL="114300" distR="114300">
             <wp:extent cx="5399730" cy="3162300"/>
             <wp:effectExtent b="0" l="0" r="0" t="0"/>
-            <wp:docPr id="18" name="image6.png"/>
+            <wp:docPr id="18" name="image5.png"/>
             <a:graphic>
               <a:graphicData uri="http://schemas.openxmlformats.org/drawingml/2006/picture">
                 <pic:pic>
                   <pic:nvPicPr>
-                    <pic:cNvPr id="0" name="image6.png"/>
+                    <pic:cNvPr id="0" name="image5.png"/>
                     <pic:cNvPicPr preferRelativeResize="0"/>
                   </pic:nvPicPr>
                   <pic:blipFill>
@@ -8034,12 +8034,12 @@
           <wp:extent cx="669290" cy="669290"/>
           <wp:effectExtent b="0" l="0" r="0" t="0"/>
           <wp:wrapSquare wrapText="bothSides" distB="0" distT="0" distL="114300" distR="114300"/>
-          <wp:docPr descr="psi-negro.png" id="14" name="image2.png"/>
+          <wp:docPr descr="psi-negro.png" id="14" name="image4.png"/>
           <a:graphic>
             <a:graphicData uri="http://schemas.openxmlformats.org/drawingml/2006/picture">
               <pic:pic>
                 <pic:nvPicPr>
-                  <pic:cNvPr descr="psi-negro.png" id="0" name="image2.png"/>
+                  <pic:cNvPr descr="psi-negro.png" id="0" name="image4.png"/>
                   <pic:cNvPicPr preferRelativeResize="0"/>
                 </pic:nvPicPr>
                 <pic:blipFill>
@@ -8079,12 +8079,12 @@
           <wp:extent cx="425450" cy="666750"/>
           <wp:effectExtent b="0" l="0" r="0" t="0"/>
           <wp:wrapSquare wrapText="bothSides" distB="0" distT="0" distL="114300" distR="114300"/>
-          <wp:docPr descr="UNPA.JPG" id="17" name="image3.jpg"/>
+          <wp:docPr descr="UNPA.JPG" id="17" name="image1.jpg"/>
           <a:graphic>
             <a:graphicData uri="http://schemas.openxmlformats.org/drawingml/2006/picture">
               <pic:pic>
                 <pic:nvPicPr>
-                  <pic:cNvPr descr="UNPA.JPG" id="0" name="image3.jpg"/>
+                  <pic:cNvPr descr="UNPA.JPG" id="0" name="image1.jpg"/>
                   <pic:cNvPicPr preferRelativeResize="0"/>
                 </pic:nvPicPr>
                 <pic:blipFill>

</xml_diff>

<commit_message>
docs: actualización manuales 25-11
</commit_message>
<xml_diff>
--- a/Etapa Construcción - Iteración 1/Arquitectura del Sistema - Kairos - NexTech.docx
+++ b/Etapa Construcción - Iteración 1/Arquitectura del Sistema - Kairos - NexTech.docx
@@ -906,12 +906,12 @@
             <wp:extent cx="1304925" cy="2019300"/>
             <wp:effectExtent b="0" l="0" r="0" t="0"/>
             <wp:wrapSquare wrapText="bothSides" distB="0" distT="0" distL="114300" distR="114300"/>
-            <wp:docPr descr="UNPA.JPG" id="13" name="image2.jpg"/>
+            <wp:docPr descr="UNPA.JPG" id="13" name="image1.jpg"/>
             <a:graphic>
               <a:graphicData uri="http://schemas.openxmlformats.org/drawingml/2006/picture">
                 <pic:pic>
                   <pic:nvPicPr>
-                    <pic:cNvPr descr="UNPA.JPG" id="0" name="image2.jpg"/>
+                    <pic:cNvPr descr="UNPA.JPG" id="0" name="image1.jpg"/>
                     <pic:cNvPicPr preferRelativeResize="0"/>
                   </pic:nvPicPr>
                   <pic:blipFill>
@@ -1339,7 +1339,7 @@
     </w:p>
     <w:sdt>
       <w:sdtPr>
-        <w:id w:val="1390231253"/>
+        <w:id w:val="-487435273"/>
         <w:docPartObj>
           <w:docPartGallery w:val="Table of Contents"/>
           <w:docPartUnique w:val="1"/>
@@ -5073,12 +5073,12 @@
           <wp:inline distB="114300" distT="114300" distL="114300" distR="114300">
             <wp:extent cx="5399730" cy="4343400"/>
             <wp:effectExtent b="0" l="0" r="0" t="0"/>
-            <wp:docPr id="16" name="image7.png"/>
+            <wp:docPr id="16" name="image6.png"/>
             <a:graphic>
               <a:graphicData uri="http://schemas.openxmlformats.org/drawingml/2006/picture">
                 <pic:pic>
                   <pic:nvPicPr>
-                    <pic:cNvPr id="0" name="image7.png"/>
+                    <pic:cNvPr id="0" name="image6.png"/>
                     <pic:cNvPicPr preferRelativeResize="0"/>
                   </pic:nvPicPr>
                   <pic:blipFill>
@@ -7290,12 +7290,12 @@
           <wp:inline distB="114300" distT="114300" distL="114300" distR="114300">
             <wp:extent cx="5399730" cy="2400300"/>
             <wp:effectExtent b="0" l="0" r="0" t="0"/>
-            <wp:docPr id="15" name="image6.png"/>
+            <wp:docPr id="15" name="image7.png"/>
             <a:graphic>
               <a:graphicData uri="http://schemas.openxmlformats.org/drawingml/2006/picture">
                 <pic:pic>
                   <pic:nvPicPr>
-                    <pic:cNvPr id="0" name="image6.png"/>
+                    <pic:cNvPr id="0" name="image7.png"/>
                     <pic:cNvPicPr preferRelativeResize="0"/>
                   </pic:nvPicPr>
                   <pic:blipFill>
@@ -8034,12 +8034,12 @@
           <wp:extent cx="669290" cy="669290"/>
           <wp:effectExtent b="0" l="0" r="0" t="0"/>
           <wp:wrapSquare wrapText="bothSides" distB="0" distT="0" distL="114300" distR="114300"/>
-          <wp:docPr descr="psi-negro.png" id="14" name="image4.png"/>
+          <wp:docPr descr="psi-negro.png" id="14" name="image2.png"/>
           <a:graphic>
             <a:graphicData uri="http://schemas.openxmlformats.org/drawingml/2006/picture">
               <pic:pic>
                 <pic:nvPicPr>
-                  <pic:cNvPr descr="psi-negro.png" id="0" name="image4.png"/>
+                  <pic:cNvPr descr="psi-negro.png" id="0" name="image2.png"/>
                   <pic:cNvPicPr preferRelativeResize="0"/>
                 </pic:nvPicPr>
                 <pic:blipFill>
@@ -8079,12 +8079,12 @@
           <wp:extent cx="425450" cy="666750"/>
           <wp:effectExtent b="0" l="0" r="0" t="0"/>
           <wp:wrapSquare wrapText="bothSides" distB="0" distT="0" distL="114300" distR="114300"/>
-          <wp:docPr descr="UNPA.JPG" id="17" name="image1.jpg"/>
+          <wp:docPr descr="UNPA.JPG" id="17" name="image4.jpg"/>
           <a:graphic>
             <a:graphicData uri="http://schemas.openxmlformats.org/drawingml/2006/picture">
               <pic:pic>
                 <pic:nvPicPr>
-                  <pic:cNvPr descr="UNPA.JPG" id="0" name="image1.jpg"/>
+                  <pic:cNvPr descr="UNPA.JPG" id="0" name="image4.jpg"/>
                   <pic:cNvPicPr preferRelativeResize="0"/>
                 </pic:nvPicPr>
                 <pic:blipFill>

</xml_diff>